<commit_message>
ADICION DE UBICACION Y CODIGO DE INVENTARIO
</commit_message>
<xml_diff>
--- a/assets/INFORME_TECNICO_PLANTILLA.docx
+++ b/assets/INFORME_TECNICO_PLANTILLA.docx
@@ -398,7 +398,7 @@
                 <w:sz w:val="16"/>
                 <w:szCs w:val="16"/>
               </w:rPr>
-              <w:t>Área</w:t>
+              <w:t>Ubicación</w:t>
             </w:r>
           </w:p>
         </w:tc>
@@ -545,8 +545,18 @@
                 <w:sz w:val="16"/>
                 <w:szCs w:val="16"/>
               </w:rPr>
-              <w:t>Sede</w:t>
-            </w:r>
+              <w:t xml:space="preserve">Código </w:t>
+            </w:r>
+            <w:proofErr w:type="gramStart"/>
+            <w:r>
+              <w:rPr>
+                <w:rFonts w:ascii="Cambria" w:hAnsi="Cambria"/>
+                <w:sz w:val="16"/>
+                <w:szCs w:val="16"/>
+              </w:rPr>
+              <w:t>de  Inventario</w:t>
+            </w:r>
+            <w:proofErr w:type="gramEnd"/>
           </w:p>
         </w:tc>
         <w:tc>
@@ -706,7 +716,25 @@
                 <w:szCs w:val="16"/>
                 <w:lang w:val="en-US"/>
               </w:rPr>
-              <w:t xml:space="preserve">2.2 Código </w:t>
+              <w:t>2.2 Código</w:t>
+            </w:r>
+            <w:r>
+              <w:rPr>
+                <w:rFonts w:ascii="Cambria" w:hAnsi="Cambria"/>
+                <w:sz w:val="16"/>
+                <w:szCs w:val="16"/>
+                <w:lang w:val="en-US"/>
+              </w:rPr>
+              <w:t xml:space="preserve"> de revisión</w:t>
+            </w:r>
+            <w:r>
+              <w:rPr>
+                <w:rFonts w:ascii="Cambria" w:hAnsi="Cambria"/>
+                <w:sz w:val="16"/>
+                <w:szCs w:val="16"/>
+                <w:lang w:val="en-US"/>
+              </w:rPr>
+              <w:t xml:space="preserve"> </w:t>
             </w:r>
           </w:p>
         </w:tc>
@@ -2409,7 +2437,7 @@
         <w:sz w:val="16"/>
         <w:szCs w:val="16"/>
       </w:rPr>
-      <w:t>30/09/2026</w:t>
+      <w:t>05/10/2026</w:t>
     </w:r>
     <w:r>
       <w:rPr>

</xml_diff>